<commit_message>
docs: Update language level to JLPT N2 in slides and self-intro docs
</commit_message>
<xml_diff>
--- a/docs/6_日本就業素養_自己PRと自己紹介.docx
+++ b/docs/6_日本就業素養_自己PRと自己紹介.docx
@@ -8,7 +8,7 @@
         <w:spacing w:before="240" w:after="120"/>
       </w:pPr>
       <w:r>
-        <w:t>日本就業素養 補講提出用ドキュメント（自己PR＆自己紹介スクリプト）</w:t>
+        <w:t>日本就業素養 補講提出用ドキュメント（自己PR＆自己紹介シート）[N3レベル・ます形]</w:t>
       </w:r>
     </w:p>
     <w:p>
@@ -70,7 +70,7 @@
         <w:spacing w:before="200" w:after="80"/>
       </w:pPr>
       <w:r>
-        <w:t>1. 自己PR文（2パターン）</w:t>
+        <w:t>1. 自己PR文（2パターン）[N3レベル・ます形]</w:t>
       </w:r>
     </w:p>
     <w:p>
@@ -79,7 +79,7 @@
         <w:spacing w:before="160" w:after="40"/>
       </w:pPr>
       <w:r>
-        <w:t>パターン1：フルスタックエンジニア（Node.js / Web開発）としての強み</w:t>
+        <w:t>パターン1：Web開発（エンジニア）の強み</w:t>
       </w:r>
     </w:p>
     <w:p>
@@ -91,7 +91,7 @@
         <w:rPr>
           <w:b/>
         </w:rPr>
-        <w:t>【タイトル】技術とビジネスリテラシーを融合させ、ユーザーの課題を解決するエンジニア</w:t>
+        <w:t>【タイトル】自分でシステムを作ることができて、ビジネスの勉強もしているエンジニアです</w:t>
       </w:r>
       <w:r/>
     </w:p>
@@ -100,7 +100,7 @@
         <w:spacing w:after="120"/>
       </w:pPr>
       <w:r>
-        <w:t>私は、JDU（Japan Digital University）でコンピュータ工学を専攻し、JavaScriptおよびNode.jsを中心としたWebアプリケーション開発の技術を磨いてきました。</w:t>
+        <w:t>私は、JDU（Japan Digital University）でコンピュータエンジニアリングを専攻して、JavaScriptやNode.jsを使ったWeb開発を勉強してきました。</w:t>
       </w:r>
     </w:p>
     <w:p>
@@ -108,7 +108,7 @@
         <w:spacing w:after="120"/>
       </w:pPr>
       <w:r>
-        <w:t>直近の開発成果として、ウズベキスタン国内の多言語ユーザー向けに、飲食店の位置情報と口コミを共有できるWebアプリ「Mikka」を構築しました。このプロジェクトでは、バックエンドにClean Architectureを採用して拡張性の高いAPI（Node.js, TypeScript, PostgreSQL）を設計し、フロントエンドでは地図（Leaflet）とGoogle Gemini APIを用いたAIチャットボットを連携させました。</w:t>
+        <w:t>最近の開発実績として、ウズベキスタンにあるレストランの情報を共有できるWebアプリ「Mikka」を自分で作りました。このアプリでは、Node.jsとTypeScript、PostgreSQLを使ってデータを管理しました。また、地図を表示して店を探す機能や、GoogleのGemini APIを使ったAIチャットでおすすめの店を聞く機能も実装しました。</w:t>
       </w:r>
     </w:p>
     <w:p>
@@ -116,7 +116,7 @@
         <w:spacing w:after="120"/>
       </w:pPr>
       <w:r>
-        <w:t>また、産業能率大学でビジネスリテラシーを学び、技術だけでなく「ユーザーや市場が何を求めているか」というビジネス視点を持って要件定義からデプロイまで一人でやり遂げました。</w:t>
+        <w:t>さらに、産業能率大学でビジネスの基礎も勉強しました。ですから、技術だけでなく「ユーザーが本当に使いやすいシステムは何か」を考えて開発することができます。</w:t>
       </w:r>
     </w:p>
     <w:p>
@@ -124,7 +124,7 @@
         <w:spacing w:after="120"/>
       </w:pPr>
       <w:r>
-        <w:t>貴社では、このフルスタックな開発力と課題解決力を活かし、即戦力のエンジニアとして実用的なプロダクト開発に貢献します。</w:t>
+        <w:t>私の技術力を活かして、貴社で使いやすいWebサービスを作ることに貢献したいです。</w:t>
       </w:r>
     </w:p>
     <w:p>
@@ -141,7 +141,7 @@
         <w:spacing w:before="160" w:after="40"/>
       </w:pPr>
       <w:r>
-        <w:t>パターン2：日本語力 ✕ デザイン力を活かした「架け橋」としての強み</w:t>
+        <w:t>パターン2：日本語力 ✕ デザイン力の強み</w:t>
       </w:r>
     </w:p>
     <w:p>
@@ -153,7 +153,7 @@
         <w:rPr>
           <w:b/>
         </w:rPr>
-        <w:t>【タイトル】流暢な日本語コミュニケーション能力と、グローバルプロジェクトを形にするデザイン力</w:t>
+        <w:t>【タイトル】日本語でのコミュニケーションと、デザインを作る力があります</w:t>
       </w:r>
       <w:r/>
     </w:p>
@@ -162,7 +162,7 @@
         <w:spacing w:after="120"/>
       </w:pPr>
       <w:r>
-        <w:t>私の強みは、JLPT（日本語能力試験）最高レベルに相当する高度な日本語能力（C2）と、複数国（日本・中国など）のパートナーとの業務を通じて培ったデザイン表現力です。</w:t>
+        <w:t>私の強みは、日本語を使って日本の人と仕事をすることと、グラフィックデザインを作る力があることです。</w:t>
       </w:r>
     </w:p>
     <w:p>
@@ -170,7 +170,7 @@
         <w:spacing w:after="120"/>
       </w:pPr>
       <w:r>
-        <w:t>JDU在学中、グラフィックデザイナーとして、日本のパートナー企業と直接やり取りを行い、日本向けに輸出されるTシャツのデザインを1,000件以上作成し、生産管理まで行いました。また、他校では日本語教師として20名以上の子供や大人に日本語（JLPT N5レベル）を指導した経験もあり、相手の視点に立って物事を分かりやすく伝える能力に長けています。</w:t>
+        <w:t>これまでJDU（Japan Digital University）でデザイナーとして活動し、日本に輸出するTシャツのデザインを1,000件以上作りました。日本のパートナーと日本語でやり取りをしながら、デザインの作成から生産の管理までを自分で行いました。</w:t>
       </w:r>
     </w:p>
     <w:p>
@@ -178,7 +178,7 @@
         <w:spacing w:after="120"/>
       </w:pPr>
       <w:r>
-        <w:t>このように、単なる言語の通訳にとどまらず、技術やデザインといった「専門スキル」を持って日本のチームと海外の拠点を繋ぎ、プロジェクトを円滑に進めることができます。</w:t>
+        <w:t>また、他の学校で日本語の先生として、20人以上の生徒に日本語（N5レベル）を教えた経験もあります。この経験から、難しいことを他の人に分かりやすく説明する力があります。</w:t>
       </w:r>
     </w:p>
     <w:p>
@@ -186,7 +186,7 @@
         <w:spacing w:after="120"/>
       </w:pPr>
       <w:r>
-        <w:t>貴社においても、グローバルな開発現場でのブリッジシステムエンジニア（Bridge SE）やデザイナーとして、円滑なプロジェクト推進に貢献します。</w:t>
+        <w:t>言葉の通訳だけでなく、デザインやIT of 技術を使って、日本とウズベキスタンのチームを繋ぐ「架け橋」として働きたいです。</w:t>
       </w:r>
     </w:p>
     <w:p>
@@ -203,7 +203,7 @@
         <w:spacing w:before="200" w:after="80"/>
       </w:pPr>
       <w:r>
-        <w:t>2. 3分間自己紹介スクリプト（認定試験・プレゼン動画用）</w:t>
+        <w:t>2. 自己紹介スクリプト（動画・模擬面接用）[N3レベル・ます形・標準自己紹介]</w:t>
       </w:r>
     </w:p>
     <w:p>
@@ -215,7 +215,7 @@
         <w:rPr>
           <w:b/>
         </w:rPr>
-        <w:t>【目的】</w:t>
+        <w:t>【ポイント】</w:t>
       </w:r>
       <w:r/>
     </w:p>
@@ -224,7 +224,7 @@
         <w:spacing w:after="120"/>
       </w:pPr>
       <w:r>
-        <w:t>2026年7月6日（予定）の認定試験、および自己紹介動画（3分間）でそのまま暗記して話すためのスクリプトです。ゆっくり丁寧に話すことで、約3分間（700〜800文字程度）の長さになります。</w:t>
+        <w:t>将来の目標（ビジョン）を話すのではなく、これまでのご自身の経歴、大学で学んだIT技術、デザインでの仕事実績、および日本語能力を具体的にアピールする、就業活動における「標準的で効果的な自己紹介（自己紹介シート対応）」です。</w:t>
       </w:r>
     </w:p>
     <w:p>
@@ -241,7 +241,7 @@
         <w:spacing w:before="160" w:after="40"/>
       </w:pPr>
       <w:r>
-        <w:t>スクリプト本文（日本語）</w:t>
+        <w:t>自己紹介本文（日本語）</w:t>
       </w:r>
     </w:p>
     <w:p>
@@ -257,7 +257,7 @@
         <w:spacing w:after="120"/>
       </w:pPr>
       <w:r>
-        <w:t>アブドゥラエフ・ジャブロンと申します。本日はよろしくお願いいたします。</w:t>
+        <w:t>アブドゥラエフ・ジャブロンと申します。本日は貴重なお時間をいただき、本当にありがとうございます。</w:t>
       </w:r>
     </w:p>
     <w:p>
@@ -265,7 +265,7 @@
         <w:spacing w:after="120"/>
       </w:pPr>
       <w:r>
-        <w:t>私は現在、ウズベキスタン世界言語大学でコンピュータ言語学を専攻する傍ら、JDU（Japan Digital University）でコンピュータ工学を学び、日本市場やグローバル企業で即戦力として活躍できるソフトウェアエンジニアを目指しています。また、産業能率大学でビジネスリテラシーも学びました。</w:t>
+        <w:t>私は現在、Japan Digital University（JDU）でコンピューターエンジニアリングを専攻しており、ここをメインの所属として学んでいます。また、ウズベキスタン世界言語大学のコンピューター言語学専攻をすでに卒業いたしました。さらに、産業能率大学でビジネスリテラシーについても学びました。</w:t>
       </w:r>
     </w:p>
     <w:p>
@@ -273,7 +273,7 @@
         <w:spacing w:after="120"/>
       </w:pPr>
       <w:r>
-        <w:t>私の強みは、大きく分けて2つあります。</w:t>
+        <w:t>私のこれまでの取り組みと強みは、大きく分けて2つあります。</w:t>
       </w:r>
     </w:p>
     <w:p>
@@ -287,7 +287,7 @@
         <w:rPr>
           <w:b/>
         </w:rPr>
-        <w:t>「フルスタックなWeb開発力とクリーンなコードへのこだわり」</w:t>
+        <w:t>「実践的なWebシステム開発力」</w:t>
       </w:r>
       <w:r>
         <w:t>です。</w:t>
@@ -298,7 +298,7 @@
         <w:spacing w:after="120"/>
       </w:pPr>
       <w:r>
-        <w:t>私はJavaScriptやNode.js、PostgreSQLを用いたWeb開発を得意としています。最近のコワーク活動では、飲食店口コミサイト「Mikka」というシステムをゼロから構築しました。このアプリは、地図上での位置情報連携や多言語対応に加え、Google Gemini APIを組み込んだAIチャットボットがおすすめの飲食店をレコメンドする機能を持っています。バックエンドには「クリーンアーキテクチャ」を採用し、変化に強くメンテナンスしやすいシステムを意識して設計しました。</w:t>
+        <w:t>大学では、プログラミング言語、データベース設計、ネットワークについて学びました。特にJavaScriptやNode.js、PostgreSQLを使ったバックエンド開発が得意です。最近のコワーク授業では、飲食店口コミサイト『Mikka（ミッカ）』を開発しました。これは、地図で行きたい店を探す機能や、JWTとHTTP-Only Cookieを使った安全な認証システム、そしてGemini APIを使ったAIチャットアシスタント機能を備えたシステムです。フロントエンドからバックエンドまで、一人で工夫して開発しました。</w:t>
       </w:r>
     </w:p>
     <w:p>
@@ -312,7 +312,7 @@
         <w:rPr>
           <w:b/>
         </w:rPr>
-        <w:t>「多文化な環境での高いコミュニケーション力と日本語能力」</w:t>
+        <w:t>「日本語でのコミュニケーション力と、グラフィックデザインの実務経験」</w:t>
       </w:r>
       <w:r>
         <w:t>です。</w:t>
@@ -323,7 +323,7 @@
         <w:spacing w:after="120"/>
       </w:pPr>
       <w:r>
-        <w:t>私の日本語レベルはC2（最高レベル）であり、日本人のパートナーと直接ビジネスのやり取りを行うことができます。実際、JDUではグラフィックデザイナーとして、日本向けに輸出されるTシャツのプリントデザインを1,000件以上制作し、プロジェクトを成功に導きました。また、他校で日本語教師として20名以上の学生に日本語を教えた経験もあり、難しい概念を分かりやすく伝えるスキルを持っています。</w:t>
+        <w:t>私の日本語レベルはN2（日本語能力試験N2合格）で、現在はN1合格を目指して勉強を進めています。これまでJDUでデザイナーとして活動し、日本のパートナーと日本語で直接やり取りをしながら、日本向けに輸出されるTシャツのデザインを1,000件以上制作しました。デザインの作成から生産の管理まで、言葉の壁を越えて協力して仕事を行いました。また、日本語の先生として20名以上の学生に日本語を教えた経験もあります。</w:t>
       </w:r>
     </w:p>
     <w:p>
@@ -331,15 +331,7 @@
         <w:spacing w:after="120"/>
       </w:pPr>
       <w:r>
-        <w:t>将来は、この「技術力」「デザイン・表現力」、そして「日本語力」を掛け合わせ、日本とウズベキスタン、あるいは世界を繋ぐブリッジエンジニアとして、社会に価値あるシステムを提供したいと考えています。</w:t>
-      </w:r>
-    </w:p>
-    <w:p>
-      <w:pPr>
-        <w:spacing w:after="120"/>
-      </w:pPr>
-      <w:r>
-        <w:t>本日は、私のこれまでの開発実績や自己PRについてお伝えできることを楽しみにしております。どうぞよろしくお願いいたします。</w:t>
+        <w:t>このように、私は「Webシステム開発の技術」と「日本語によるコミュニケーション力」、そして「デザインの実務経験」を身につけてきました。本日はどうぞよろしくお願いいたします。</w:t>
       </w:r>
     </w:p>
     <w:sectPr>

</xml_diff>